<commit_message>
Deployment: slim ONNX backend for Render, Postgres support, Vercel config, U-Net pilot, shelf-life proxy, visible-decay check
</commit_message>
<xml_diff>
--- a/releases/final_review/00_Foresight_Project_Status_Audit.docx
+++ b/releases/final_review/00_Foresight_Project_Status_Audit.docx
@@ -146,7 +146,7 @@
           <w:sz w:val="20"/>
           <w:szCs w:val="20"/>
         </w:rPr>
-        <w:t xml:space="preserve">15 October 2026</w:t>
+        <w:t xml:space="preserve">17 October 2026</w:t>
       </w:r>
     </w:p>
     <w:p>
@@ -2168,29 +2168,29 @@
         <w:tc>
           <w:tcPr>
             <w:tcW w:type="dxa" w:w="1349"/>
-            <w:shd w:fill="F6D5CC" w:color="auto" w:val="clear"/>
-            <w:tcMar>
-              <w:top w:type="dxa" w:w="50"/>
-              <w:left w:type="dxa" w:w="80"/>
-              <w:bottom w:type="dxa" w:w="50"/>
-              <w:right w:type="dxa" w:w="80"/>
-            </w:tcMar>
-            <w:vAlign w:val="center"/>
-          </w:tcPr>
-          <w:p>
-            <w:pPr>
-              <w:spacing w:after="0" w:before="0"/>
-            </w:pPr>
-            <w:r>
-              <w:rPr>
-                <w:rFonts w:ascii="Calibri" w:cs="Calibri" w:eastAsia="Calibri" w:hAnsi="Calibri"/>
-                <w:b w:val="false"/>
-                <w:bCs w:val="false"/>
-                <w:color w:val="1E1E1E"/>
-                <w:sz w:val="15"/>
-                <w:szCs w:val="15"/>
-              </w:rPr>
-              <w:t xml:space="preserve">BLOCKED</w:t>
+            <w:shd w:fill="FCEFC7" w:color="auto" w:val="clear"/>
+            <w:tcMar>
+              <w:top w:type="dxa" w:w="50"/>
+              <w:left w:type="dxa" w:w="80"/>
+              <w:bottom w:type="dxa" w:w="50"/>
+              <w:right w:type="dxa" w:w="80"/>
+            </w:tcMar>
+            <w:vAlign w:val="center"/>
+          </w:tcPr>
+          <w:p>
+            <w:pPr>
+              <w:spacing w:after="0" w:before="0"/>
+            </w:pPr>
+            <w:r>
+              <w:rPr>
+                <w:rFonts w:ascii="Calibri" w:cs="Calibri" w:eastAsia="Calibri" w:hAnsi="Calibri"/>
+                <w:b w:val="false"/>
+                <w:bCs w:val="false"/>
+                <w:color w:val="1E1E1E"/>
+                <w:sz w:val="15"/>
+                <w:szCs w:val="15"/>
+              </w:rPr>
+              <w:t xml:space="preserve">IN PROGRESS</w:t>
             </w:r>
           </w:p>
         </w:tc>
@@ -2219,18 +2219,51 @@
                 <w:sz w:val="15"/>
                 <w:szCs w:val="15"/>
               </w:rPr>
-              <w:t xml:space="preserve">Foresight-TR6-plus/annotations/</w:t>
-            </w:r>
-            <w:r>
-              <w:rPr>
-                <w:rFonts w:ascii="Calibri" w:cs="Calibri" w:eastAsia="Calibri" w:hAnsi="Calibri"/>
-                <w:b w:val="false"/>
-                <w:bCs w:val="false"/>
-                <w:color w:val="1E1E1E"/>
-                <w:sz w:val="15"/>
-                <w:szCs w:val="15"/>
-              </w:rPr>
-              <w:t xml:space="preserve"> (12 proposal-only masks)</w:t>
+              <w:t xml:space="preserve">ml/experiments/unet_pilot.py</w:t>
+            </w:r>
+            <w:r>
+              <w:rPr>
+                <w:rFonts w:ascii="Calibri" w:cs="Calibri" w:eastAsia="Calibri" w:hAnsi="Calibri"/>
+                <w:b w:val="false"/>
+                <w:bCs w:val="false"/>
+                <w:color w:val="1E1E1E"/>
+                <w:sz w:val="15"/>
+                <w:szCs w:val="15"/>
+              </w:rPr>
+              <w:t xml:space="preserve">, </w:t>
+            </w:r>
+            <w:r>
+              <w:rPr>
+                <w:rFonts w:ascii="Consolas" w:cs="Consolas" w:eastAsia="Consolas" w:hAnsi="Consolas"/>
+                <w:b w:val="false"/>
+                <w:bCs w:val="false"/>
+                <w:color w:val="1E1E1E"/>
+                <w:sz w:val="15"/>
+                <w:szCs w:val="15"/>
+              </w:rPr>
+              <w:t xml:space="preserve">backend/models/unet_pilot.pt</w:t>
+            </w:r>
+            <w:r>
+              <w:rPr>
+                <w:rFonts w:ascii="Calibri" w:cs="Calibri" w:eastAsia="Calibri" w:hAnsi="Calibri"/>
+                <w:b w:val="false"/>
+                <w:bCs w:val="false"/>
+                <w:color w:val="1E1E1E"/>
+                <w:sz w:val="15"/>
+                <w:szCs w:val="15"/>
+              </w:rPr>
+              <w:t xml:space="preserve">, </w:t>
+            </w:r>
+            <w:r>
+              <w:rPr>
+                <w:rFonts w:ascii="Consolas" w:cs="Consolas" w:eastAsia="Consolas" w:hAnsi="Consolas"/>
+                <w:b w:val="false"/>
+                <w:bCs w:val="false"/>
+                <w:color w:val="1E1E1E"/>
+                <w:sz w:val="15"/>
+                <w:szCs w:val="15"/>
+              </w:rPr>
+              <w:t xml:space="preserve">backend/unet_model.py</w:t>
             </w:r>
           </w:p>
         </w:tc>
@@ -2259,7 +2292,7 @@
                 <w:sz w:val="15"/>
                 <w:szCs w:val="15"/>
               </w:rPr>
-              <w:t xml:space="preserve">0 human-reviewed masks (annotation status: pending_review 12, pending 84); training on proposals would be fabricated ground truth</w:t>
+              <w:t xml:space="preserve">PILOT served by the API: trained on 102 machine-generated masks; fruit Dice 0.98, decay Dice 0.59 vs machine masks (n=63); 0 human-drawn polygons, so not validated</w:t>
             </w:r>
           </w:p>
         </w:tc>
@@ -2292,36 +2325,36 @@
                 <w:sz w:val="15"/>
                 <w:szCs w:val="15"/>
               </w:rPr>
-              <w:t xml:space="preserve">YOLO detection</w:t>
+              <w:t xml:space="preserve">Visible-decay check (human labels)</w:t>
             </w:r>
           </w:p>
         </w:tc>
         <w:tc>
           <w:tcPr>
             <w:tcW w:type="dxa" w:w="1349"/>
-            <w:shd w:fill="E4E4E4" w:color="auto" w:val="clear"/>
-            <w:tcMar>
-              <w:top w:type="dxa" w:w="50"/>
-              <w:left w:type="dxa" w:w="80"/>
-              <w:bottom w:type="dxa" w:w="50"/>
-              <w:right w:type="dxa" w:w="80"/>
-            </w:tcMar>
-            <w:vAlign w:val="center"/>
-          </w:tcPr>
-          <w:p>
-            <w:pPr>
-              <w:spacing w:after="0" w:before="0"/>
-            </w:pPr>
-            <w:r>
-              <w:rPr>
-                <w:rFonts w:ascii="Calibri" w:cs="Calibri" w:eastAsia="Calibri" w:hAnsi="Calibri"/>
-                <w:b w:val="false"/>
-                <w:bCs w:val="false"/>
-                <w:color w:val="1E1E1E"/>
-                <w:sz w:val="15"/>
-                <w:szCs w:val="15"/>
-              </w:rPr>
-              <w:t xml:space="preserve">NOT IMPLEMENTED</w:t>
+            <w:shd w:fill="D7EDDD" w:color="auto" w:val="clear"/>
+            <w:tcMar>
+              <w:top w:type="dxa" w:w="50"/>
+              <w:left w:type="dxa" w:w="80"/>
+              <w:bottom w:type="dxa" w:w="50"/>
+              <w:right w:type="dxa" w:w="80"/>
+            </w:tcMar>
+            <w:vAlign w:val="center"/>
+          </w:tcPr>
+          <w:p>
+            <w:pPr>
+              <w:spacing w:after="0" w:before="0"/>
+            </w:pPr>
+            <w:r>
+              <w:rPr>
+                <w:rFonts w:ascii="Calibri" w:cs="Calibri" w:eastAsia="Calibri" w:hAnsi="Calibri"/>
+                <w:b w:val="false"/>
+                <w:bCs w:val="false"/>
+                <w:color w:val="1E1E1E"/>
+                <w:sz w:val="15"/>
+                <w:szCs w:val="15"/>
+              </w:rPr>
+              <w:t xml:space="preserve">COMPLETE</w:t>
             </w:r>
           </w:p>
         </w:tc>
@@ -2342,14 +2375,36 @@
             </w:pPr>
             <w:r>
               <w:rPr>
-                <w:rFonts w:ascii="Calibri" w:cs="Calibri" w:eastAsia="Calibri" w:hAnsi="Calibri"/>
-                <w:b w:val="false"/>
-                <w:bCs w:val="false"/>
-                <w:color w:val="1E1E1E"/>
-                <w:sz w:val="15"/>
-                <w:szCs w:val="15"/>
-              </w:rPr>
-              <w:t xml:space="preserve">—</w:t>
+                <w:rFonts w:ascii="Consolas" w:cs="Consolas" w:eastAsia="Consolas" w:hAnsi="Consolas"/>
+                <w:b w:val="false"/>
+                <w:bCs w:val="false"/>
+                <w:color w:val="1E1E1E"/>
+                <w:sz w:val="15"/>
+                <w:szCs w:val="15"/>
+              </w:rPr>
+              <w:t xml:space="preserve">ml/experiments/visible_decay_probe.py</w:t>
+            </w:r>
+            <w:r>
+              <w:rPr>
+                <w:rFonts w:ascii="Calibri" w:cs="Calibri" w:eastAsia="Calibri" w:hAnsi="Calibri"/>
+                <w:b w:val="false"/>
+                <w:bCs w:val="false"/>
+                <w:color w:val="1E1E1E"/>
+                <w:sz w:val="15"/>
+                <w:szCs w:val="15"/>
+              </w:rPr>
+              <w:t xml:space="preserve">, </w:t>
+            </w:r>
+            <w:r>
+              <w:rPr>
+                <w:rFonts w:ascii="Consolas" w:cs="Consolas" w:eastAsia="Consolas" w:hAnsi="Consolas"/>
+                <w:b w:val="false"/>
+                <w:bCs w:val="false"/>
+                <w:color w:val="1E1E1E"/>
+                <w:sz w:val="15"/>
+                <w:szCs w:val="15"/>
+              </w:rPr>
+              <w:t xml:space="preserve">backend/models/visible_decay_probe.json</w:t>
             </w:r>
           </w:p>
         </w:tc>
@@ -2377,7 +2432,7 @@
                 <w:sz w:val="15"/>
                 <w:szCs w:val="15"/>
               </w:rPr>
-              <w:t xml:space="preserve">TR-6 images are single-item with no bounding boxes; detection not justified for the current data</w:t>
+              <w:t xml:space="preserve">165 human decisions; test accuracy 0.931 (n=29); served by the API</w:t>
             </w:r>
           </w:p>
         </w:tc>
@@ -2411,7 +2466,7 @@
                 <w:sz w:val="15"/>
                 <w:szCs w:val="15"/>
               </w:rPr>
-              <w:t xml:space="preserve">FastAPI backend</w:t>
+              <w:t xml:space="preserve">Shelf-life (proxy regression)</w:t>
             </w:r>
           </w:p>
         </w:tc>
@@ -2469,7 +2524,7 @@
                 <w:sz w:val="15"/>
                 <w:szCs w:val="15"/>
               </w:rPr>
-              <w:t xml:space="preserve">backend/main.py</w:t>
+              <w:t xml:space="preserve">ml/experiments/shelf_life_proxy.py</w:t>
             </w:r>
             <w:r>
               <w:rPr>
@@ -2491,40 +2546,7 @@
                 <w:sz w:val="15"/>
                 <w:szCs w:val="15"/>
               </w:rPr>
-              <w:t xml:space="preserve">inference.py</w:t>
-            </w:r>
-            <w:r>
-              <w:rPr>
-                <w:rFonts w:ascii="Calibri" w:cs="Calibri" w:eastAsia="Calibri" w:hAnsi="Calibri"/>
-                <w:b w:val="false"/>
-                <w:bCs w:val="false"/>
-                <w:color w:val="1E1E1E"/>
-                <w:sz w:val="15"/>
-                <w:szCs w:val="15"/>
-              </w:rPr>
-              <w:t xml:space="preserve">, </w:t>
-            </w:r>
-            <w:r>
-              <w:rPr>
-                <w:rFonts w:ascii="Consolas" w:cs="Consolas" w:eastAsia="Consolas" w:hAnsi="Consolas"/>
-                <w:b w:val="false"/>
-                <w:bCs w:val="false"/>
-                <w:color w:val="1E1E1E"/>
-                <w:sz w:val="15"/>
-                <w:szCs w:val="15"/>
-              </w:rPr>
-              <w:t xml:space="preserve">db.py</w:t>
-            </w:r>
-            <w:r>
-              <w:rPr>
-                <w:rFonts w:ascii="Calibri" w:cs="Calibri" w:eastAsia="Calibri" w:hAnsi="Calibri"/>
-                <w:b w:val="false"/>
-                <w:bCs w:val="false"/>
-                <w:color w:val="1E1E1E"/>
-                <w:sz w:val="15"/>
-                <w:szCs w:val="15"/>
-              </w:rPr>
-              <w:t xml:space="preserve">; 23 backend tests</w:t>
+              <w:t xml:space="preserve">backend/models/shelf_life_proxy.json</w:t>
             </w:r>
           </w:p>
         </w:tc>
@@ -2553,7 +2575,7 @@
                 <w:sz w:val="15"/>
                 <w:szCs w:val="15"/>
               </w:rPr>
-              <w:t xml:space="preserve">real checkpoint loaded at startup; validation, structured errors, CORS, SQLite history, PDF, XAI</w:t>
+              <w:t xml:space="preserve">PROXY target (days to 'Spoiled' label); test MAE 4.29 d, R² 0.89; served by the API</w:t>
             </w:r>
           </w:p>
         </w:tc>
@@ -2586,36 +2608,36 @@
                 <w:sz w:val="15"/>
                 <w:szCs w:val="15"/>
               </w:rPr>
-              <w:t xml:space="preserve">React frontend integration</w:t>
+              <w:t xml:space="preserve">YOLO detection</w:t>
             </w:r>
           </w:p>
         </w:tc>
         <w:tc>
           <w:tcPr>
             <w:tcW w:type="dxa" w:w="1349"/>
-            <w:shd w:fill="D7EDDD" w:color="auto" w:val="clear"/>
-            <w:tcMar>
-              <w:top w:type="dxa" w:w="50"/>
-              <w:left w:type="dxa" w:w="80"/>
-              <w:bottom w:type="dxa" w:w="50"/>
-              <w:right w:type="dxa" w:w="80"/>
-            </w:tcMar>
-            <w:vAlign w:val="center"/>
-          </w:tcPr>
-          <w:p>
-            <w:pPr>
-              <w:spacing w:after="0" w:before="0"/>
-            </w:pPr>
-            <w:r>
-              <w:rPr>
-                <w:rFonts w:ascii="Calibri" w:cs="Calibri" w:eastAsia="Calibri" w:hAnsi="Calibri"/>
-                <w:b w:val="false"/>
-                <w:bCs w:val="false"/>
-                <w:color w:val="1E1E1E"/>
-                <w:sz w:val="15"/>
-                <w:szCs w:val="15"/>
-              </w:rPr>
-              <w:t xml:space="preserve">COMPLETE</w:t>
+            <w:shd w:fill="E4E4E4" w:color="auto" w:val="clear"/>
+            <w:tcMar>
+              <w:top w:type="dxa" w:w="50"/>
+              <w:left w:type="dxa" w:w="80"/>
+              <w:bottom w:type="dxa" w:w="50"/>
+              <w:right w:type="dxa" w:w="80"/>
+            </w:tcMar>
+            <w:vAlign w:val="center"/>
+          </w:tcPr>
+          <w:p>
+            <w:pPr>
+              <w:spacing w:after="0" w:before="0"/>
+            </w:pPr>
+            <w:r>
+              <w:rPr>
+                <w:rFonts w:ascii="Calibri" w:cs="Calibri" w:eastAsia="Calibri" w:hAnsi="Calibri"/>
+                <w:b w:val="false"/>
+                <w:bCs w:val="false"/>
+                <w:color w:val="1E1E1E"/>
+                <w:sz w:val="15"/>
+                <w:szCs w:val="15"/>
+              </w:rPr>
+              <w:t xml:space="preserve">NOT IMPLEMENTED</w:t>
             </w:r>
           </w:p>
         </w:tc>
@@ -2636,25 +2658,14 @@
             </w:pPr>
             <w:r>
               <w:rPr>
-                <w:rFonts w:ascii="Consolas" w:cs="Consolas" w:eastAsia="Consolas" w:hAnsi="Consolas"/>
-                <w:b w:val="false"/>
-                <w:bCs w:val="false"/>
-                <w:color w:val="1E1E1E"/>
-                <w:sz w:val="15"/>
-                <w:szCs w:val="15"/>
-              </w:rPr>
-              <w:t xml:space="preserve">frontend/src/api.js</w:t>
-            </w:r>
-            <w:r>
-              <w:rPr>
-                <w:rFonts w:ascii="Calibri" w:cs="Calibri" w:eastAsia="Calibri" w:hAnsi="Calibri"/>
-                <w:b w:val="false"/>
-                <w:bCs w:val="false"/>
-                <w:color w:val="1E1E1E"/>
-                <w:sz w:val="15"/>
-                <w:szCs w:val="15"/>
-              </w:rPr>
-              <w:t xml:space="preserve">, pages; build + 7 Vitest tests + UI contract check</w:t>
+                <w:rFonts w:ascii="Calibri" w:cs="Calibri" w:eastAsia="Calibri" w:hAnsi="Calibri"/>
+                <w:b w:val="false"/>
+                <w:bCs w:val="false"/>
+                <w:color w:val="1E1E1E"/>
+                <w:sz w:val="15"/>
+                <w:szCs w:val="15"/>
+              </w:rPr>
+              <w:t xml:space="preserve">—</w:t>
             </w:r>
           </w:p>
         </w:tc>
@@ -2682,7 +2693,7 @@
                 <w:sz w:val="15"/>
                 <w:szCs w:val="15"/>
               </w:rPr>
-              <w:t xml:space="preserve">44/44 UI-consumed fields present in real responses; browser checks passed</w:t>
+              <w:t xml:space="preserve">TR-6 images are single-item with no bounding boxes; detection not justified for the current data</w:t>
             </w:r>
           </w:p>
         </w:tc>
@@ -2716,7 +2727,7 @@
                 <w:sz w:val="15"/>
                 <w:szCs w:val="15"/>
               </w:rPr>
-              <w:t xml:space="preserve">Database + prediction history</w:t>
+              <w:t xml:space="preserve">FastAPI backend</w:t>
             </w:r>
           </w:p>
         </w:tc>
@@ -2774,18 +2785,62 @@
                 <w:sz w:val="15"/>
                 <w:szCs w:val="15"/>
               </w:rPr>
-              <w:t xml:space="preserve">backend/db.py</w:t>
-            </w:r>
-            <w:r>
-              <w:rPr>
-                <w:rFonts w:ascii="Calibri" w:cs="Calibri" w:eastAsia="Calibri" w:hAnsi="Calibri"/>
-                <w:b w:val="false"/>
-                <w:bCs w:val="false"/>
-                <w:color w:val="1E1E1E"/>
-                <w:sz w:val="15"/>
-                <w:szCs w:val="15"/>
-              </w:rPr>
-              <w:t xml:space="preserve">; test B16; E2E E06–E07</w:t>
+              <w:t xml:space="preserve">backend/main.py</w:t>
+            </w:r>
+            <w:r>
+              <w:rPr>
+                <w:rFonts w:ascii="Calibri" w:cs="Calibri" w:eastAsia="Calibri" w:hAnsi="Calibri"/>
+                <w:b w:val="false"/>
+                <w:bCs w:val="false"/>
+                <w:color w:val="1E1E1E"/>
+                <w:sz w:val="15"/>
+                <w:szCs w:val="15"/>
+              </w:rPr>
+              <w:t xml:space="preserve">, </w:t>
+            </w:r>
+            <w:r>
+              <w:rPr>
+                <w:rFonts w:ascii="Consolas" w:cs="Consolas" w:eastAsia="Consolas" w:hAnsi="Consolas"/>
+                <w:b w:val="false"/>
+                <w:bCs w:val="false"/>
+                <w:color w:val="1E1E1E"/>
+                <w:sz w:val="15"/>
+                <w:szCs w:val="15"/>
+              </w:rPr>
+              <w:t xml:space="preserve">inference.py</w:t>
+            </w:r>
+            <w:r>
+              <w:rPr>
+                <w:rFonts w:ascii="Calibri" w:cs="Calibri" w:eastAsia="Calibri" w:hAnsi="Calibri"/>
+                <w:b w:val="false"/>
+                <w:bCs w:val="false"/>
+                <w:color w:val="1E1E1E"/>
+                <w:sz w:val="15"/>
+                <w:szCs w:val="15"/>
+              </w:rPr>
+              <w:t xml:space="preserve">, </w:t>
+            </w:r>
+            <w:r>
+              <w:rPr>
+                <w:rFonts w:ascii="Consolas" w:cs="Consolas" w:eastAsia="Consolas" w:hAnsi="Consolas"/>
+                <w:b w:val="false"/>
+                <w:bCs w:val="false"/>
+                <w:color w:val="1E1E1E"/>
+                <w:sz w:val="15"/>
+                <w:szCs w:val="15"/>
+              </w:rPr>
+              <w:t xml:space="preserve">db.py</w:t>
+            </w:r>
+            <w:r>
+              <w:rPr>
+                <w:rFonts w:ascii="Calibri" w:cs="Calibri" w:eastAsia="Calibri" w:hAnsi="Calibri"/>
+                <w:b w:val="false"/>
+                <w:bCs w:val="false"/>
+                <w:color w:val="1E1E1E"/>
+                <w:sz w:val="15"/>
+                <w:szCs w:val="15"/>
+              </w:rPr>
+              <w:t xml:space="preserve">; 23 backend tests</w:t>
             </w:r>
           </w:p>
         </w:tc>
@@ -2814,7 +2869,7 @@
                 <w:sz w:val="15"/>
                 <w:szCs w:val="15"/>
               </w:rPr>
-              <w:t xml:space="preserve">SQLite; persists across restart; uploaded images not stored</w:t>
+              <w:t xml:space="preserve">real checkpoint loaded at startup; validation, structured errors, CORS, SQLite history, PDF, XAI</w:t>
             </w:r>
           </w:p>
         </w:tc>
@@ -2847,7 +2902,7 @@
                 <w:sz w:val="15"/>
                 <w:szCs w:val="15"/>
               </w:rPr>
-              <w:t xml:space="preserve">Automated + end-to-end testing</w:t>
+              <w:t xml:space="preserve">React frontend integration</w:t>
             </w:r>
           </w:p>
         </w:tc>
@@ -2904,6 +2959,267 @@
                 <w:sz w:val="15"/>
                 <w:szCs w:val="15"/>
               </w:rPr>
+              <w:t xml:space="preserve">frontend/src/api.js</w:t>
+            </w:r>
+            <w:r>
+              <w:rPr>
+                <w:rFonts w:ascii="Calibri" w:cs="Calibri" w:eastAsia="Calibri" w:hAnsi="Calibri"/>
+                <w:b w:val="false"/>
+                <w:bCs w:val="false"/>
+                <w:color w:val="1E1E1E"/>
+                <w:sz w:val="15"/>
+                <w:szCs w:val="15"/>
+              </w:rPr>
+              <w:t xml:space="preserve">, pages; build + 7 Vitest tests + UI contract check</w:t>
+            </w:r>
+          </w:p>
+        </w:tc>
+        <w:tc>
+          <w:tcPr>
+            <w:tcW w:type="dxa" w:w="3278"/>
+            <w:tcMar>
+              <w:top w:type="dxa" w:w="50"/>
+              <w:left w:type="dxa" w:w="80"/>
+              <w:bottom w:type="dxa" w:w="50"/>
+              <w:right w:type="dxa" w:w="80"/>
+            </w:tcMar>
+            <w:vAlign w:val="center"/>
+          </w:tcPr>
+          <w:p>
+            <w:pPr>
+              <w:spacing w:after="0" w:before="0"/>
+            </w:pPr>
+            <w:r>
+              <w:rPr>
+                <w:rFonts w:ascii="Calibri" w:cs="Calibri" w:eastAsia="Calibri" w:hAnsi="Calibri"/>
+                <w:b w:val="false"/>
+                <w:bCs w:val="false"/>
+                <w:color w:val="1E1E1E"/>
+                <w:sz w:val="15"/>
+                <w:szCs w:val="15"/>
+              </w:rPr>
+              <w:t xml:space="preserve">44/44 UI-consumed fields present in real responses; browser checks passed</w:t>
+            </w:r>
+          </w:p>
+        </w:tc>
+      </w:tr>
+      <w:tr>
+        <w:trPr>
+          <w:cantSplit/>
+        </w:trPr>
+        <w:tc>
+          <w:tcPr>
+            <w:tcW w:type="dxa" w:w="1831"/>
+            <w:shd w:fill="F5F7F5" w:color="auto" w:val="clear"/>
+            <w:tcMar>
+              <w:top w:type="dxa" w:w="50"/>
+              <w:left w:type="dxa" w:w="80"/>
+              <w:bottom w:type="dxa" w:w="50"/>
+              <w:right w:type="dxa" w:w="80"/>
+            </w:tcMar>
+            <w:vAlign w:val="center"/>
+          </w:tcPr>
+          <w:p>
+            <w:pPr>
+              <w:spacing w:after="0" w:before="0"/>
+            </w:pPr>
+            <w:r>
+              <w:rPr>
+                <w:rFonts w:ascii="Calibri" w:cs="Calibri" w:eastAsia="Calibri" w:hAnsi="Calibri"/>
+                <w:b w:val="false"/>
+                <w:bCs w:val="false"/>
+                <w:color w:val="1E1E1E"/>
+                <w:sz w:val="15"/>
+                <w:szCs w:val="15"/>
+              </w:rPr>
+              <w:t xml:space="preserve">Database + prediction history</w:t>
+            </w:r>
+          </w:p>
+        </w:tc>
+        <w:tc>
+          <w:tcPr>
+            <w:tcW w:type="dxa" w:w="1349"/>
+            <w:shd w:fill="D7EDDD" w:color="auto" w:val="clear"/>
+            <w:tcMar>
+              <w:top w:type="dxa" w:w="50"/>
+              <w:left w:type="dxa" w:w="80"/>
+              <w:bottom w:type="dxa" w:w="50"/>
+              <w:right w:type="dxa" w:w="80"/>
+            </w:tcMar>
+            <w:vAlign w:val="center"/>
+          </w:tcPr>
+          <w:p>
+            <w:pPr>
+              <w:spacing w:after="0" w:before="0"/>
+            </w:pPr>
+            <w:r>
+              <w:rPr>
+                <w:rFonts w:ascii="Calibri" w:cs="Calibri" w:eastAsia="Calibri" w:hAnsi="Calibri"/>
+                <w:b w:val="false"/>
+                <w:bCs w:val="false"/>
+                <w:color w:val="1E1E1E"/>
+                <w:sz w:val="15"/>
+                <w:szCs w:val="15"/>
+              </w:rPr>
+              <w:t xml:space="preserve">COMPLETE</w:t>
+            </w:r>
+          </w:p>
+        </w:tc>
+        <w:tc>
+          <w:tcPr>
+            <w:tcW w:type="dxa" w:w="3180"/>
+            <w:shd w:fill="F5F7F5" w:color="auto" w:val="clear"/>
+            <w:tcMar>
+              <w:top w:type="dxa" w:w="50"/>
+              <w:left w:type="dxa" w:w="80"/>
+              <w:bottom w:type="dxa" w:w="50"/>
+              <w:right w:type="dxa" w:w="80"/>
+            </w:tcMar>
+            <w:vAlign w:val="center"/>
+          </w:tcPr>
+          <w:p>
+            <w:pPr>
+              <w:spacing w:after="0" w:before="0"/>
+            </w:pPr>
+            <w:r>
+              <w:rPr>
+                <w:rFonts w:ascii="Consolas" w:cs="Consolas" w:eastAsia="Consolas" w:hAnsi="Consolas"/>
+                <w:b w:val="false"/>
+                <w:bCs w:val="false"/>
+                <w:color w:val="1E1E1E"/>
+                <w:sz w:val="15"/>
+                <w:szCs w:val="15"/>
+              </w:rPr>
+              <w:t xml:space="preserve">backend/db.py</w:t>
+            </w:r>
+            <w:r>
+              <w:rPr>
+                <w:rFonts w:ascii="Calibri" w:cs="Calibri" w:eastAsia="Calibri" w:hAnsi="Calibri"/>
+                <w:b w:val="false"/>
+                <w:bCs w:val="false"/>
+                <w:color w:val="1E1E1E"/>
+                <w:sz w:val="15"/>
+                <w:szCs w:val="15"/>
+              </w:rPr>
+              <w:t xml:space="preserve">; test B16; E2E E06–E07</w:t>
+            </w:r>
+          </w:p>
+        </w:tc>
+        <w:tc>
+          <w:tcPr>
+            <w:tcW w:type="dxa" w:w="3278"/>
+            <w:shd w:fill="F5F7F5" w:color="auto" w:val="clear"/>
+            <w:tcMar>
+              <w:top w:type="dxa" w:w="50"/>
+              <w:left w:type="dxa" w:w="80"/>
+              <w:bottom w:type="dxa" w:w="50"/>
+              <w:right w:type="dxa" w:w="80"/>
+            </w:tcMar>
+            <w:vAlign w:val="center"/>
+          </w:tcPr>
+          <w:p>
+            <w:pPr>
+              <w:spacing w:after="0" w:before="0"/>
+            </w:pPr>
+            <w:r>
+              <w:rPr>
+                <w:rFonts w:ascii="Calibri" w:cs="Calibri" w:eastAsia="Calibri" w:hAnsi="Calibri"/>
+                <w:b w:val="false"/>
+                <w:bCs w:val="false"/>
+                <w:color w:val="1E1E1E"/>
+                <w:sz w:val="15"/>
+                <w:szCs w:val="15"/>
+              </w:rPr>
+              <w:t xml:space="preserve">SQLite; persists across restart; uploaded images not stored</w:t>
+            </w:r>
+          </w:p>
+        </w:tc>
+      </w:tr>
+      <w:tr>
+        <w:trPr>
+          <w:cantSplit/>
+        </w:trPr>
+        <w:tc>
+          <w:tcPr>
+            <w:tcW w:type="dxa" w:w="1831"/>
+            <w:tcMar>
+              <w:top w:type="dxa" w:w="50"/>
+              <w:left w:type="dxa" w:w="80"/>
+              <w:bottom w:type="dxa" w:w="50"/>
+              <w:right w:type="dxa" w:w="80"/>
+            </w:tcMar>
+            <w:vAlign w:val="center"/>
+          </w:tcPr>
+          <w:p>
+            <w:pPr>
+              <w:spacing w:after="0" w:before="0"/>
+            </w:pPr>
+            <w:r>
+              <w:rPr>
+                <w:rFonts w:ascii="Calibri" w:cs="Calibri" w:eastAsia="Calibri" w:hAnsi="Calibri"/>
+                <w:b w:val="false"/>
+                <w:bCs w:val="false"/>
+                <w:color w:val="1E1E1E"/>
+                <w:sz w:val="15"/>
+                <w:szCs w:val="15"/>
+              </w:rPr>
+              <w:t xml:space="preserve">Automated + end-to-end testing</w:t>
+            </w:r>
+          </w:p>
+        </w:tc>
+        <w:tc>
+          <w:tcPr>
+            <w:tcW w:type="dxa" w:w="1349"/>
+            <w:shd w:fill="D7EDDD" w:color="auto" w:val="clear"/>
+            <w:tcMar>
+              <w:top w:type="dxa" w:w="50"/>
+              <w:left w:type="dxa" w:w="80"/>
+              <w:bottom w:type="dxa" w:w="50"/>
+              <w:right w:type="dxa" w:w="80"/>
+            </w:tcMar>
+            <w:vAlign w:val="center"/>
+          </w:tcPr>
+          <w:p>
+            <w:pPr>
+              <w:spacing w:after="0" w:before="0"/>
+            </w:pPr>
+            <w:r>
+              <w:rPr>
+                <w:rFonts w:ascii="Calibri" w:cs="Calibri" w:eastAsia="Calibri" w:hAnsi="Calibri"/>
+                <w:b w:val="false"/>
+                <w:bCs w:val="false"/>
+                <w:color w:val="1E1E1E"/>
+                <w:sz w:val="15"/>
+                <w:szCs w:val="15"/>
+              </w:rPr>
+              <w:t xml:space="preserve">COMPLETE</w:t>
+            </w:r>
+          </w:p>
+        </w:tc>
+        <w:tc>
+          <w:tcPr>
+            <w:tcW w:type="dxa" w:w="3180"/>
+            <w:tcMar>
+              <w:top w:type="dxa" w:w="50"/>
+              <w:left w:type="dxa" w:w="80"/>
+              <w:bottom w:type="dxa" w:w="50"/>
+              <w:right w:type="dxa" w:w="80"/>
+            </w:tcMar>
+            <w:vAlign w:val="center"/>
+          </w:tcPr>
+          <w:p>
+            <w:pPr>
+              <w:spacing w:after="0" w:before="0"/>
+            </w:pPr>
+            <w:r>
+              <w:rPr>
+                <w:rFonts w:ascii="Consolas" w:cs="Consolas" w:eastAsia="Consolas" w:hAnsi="Consolas"/>
+                <w:b w:val="false"/>
+                <w:bCs w:val="false"/>
+                <w:color w:val="1E1E1E"/>
+                <w:sz w:val="15"/>
+                <w:szCs w:val="15"/>
+              </w:rPr>
               <w:t xml:space="preserve">evidence/pytest_final.log</w:t>
             </w:r>
             <w:r>
@@ -2976,7 +3292,7 @@
                 <w:sz w:val="15"/>
                 <w:szCs w:val="15"/>
               </w:rPr>
-              <w:t xml:space="preserve">pytest 33 passed in 4.86s; Vitest 7/7 passed; E2E 11/11 checks</w:t>
+              <w:t xml:space="preserve">pytest 37 passed in 4.84s; Vitest 7/7 passed; E2E 11/11 checks</w:t>
             </w:r>
           </w:p>
         </w:tc>
@@ -3459,7 +3775,7 @@
                 <w:sz w:val="15"/>
                 <w:szCs w:val="15"/>
               </w:rPr>
-              <w:t xml:space="preserve">ViT-B/16 two-head classifier (deployed); ViT-S/16 (ablations); class-conditional DCGAN; DnCNN denoiser; logistic-regression baselines on colour histograms and frozen ViT features; K-means; attention-rollout XAI. U-Net, shelf-life regression and YOLO are NOT implemented.</w:t>
+              <w:t xml:space="preserve">ViT-B/16 two-head classifier (deployed); ViT-S/16 (ablations); class-conditional DCGAN; DnCNN denoiser; logistic-regression baselines on colour histograms and frozen ViT features; K-means; attention-rollout XAI; visible-decay probe (human labels); PILOT U-Net (machine-generated masks); PROXY shelf-life ridge regressor. YOLO is NOT implemented.</w:t>
             </w:r>
           </w:p>
         </w:tc>
@@ -3896,7 +4212,7 @@
                 <w:sz w:val="15"/>
                 <w:szCs w:val="15"/>
               </w:rPr>
-              <w:t xml:space="preserve">Only the ViT-B/16 checkpoint, loaded once at startup (version </w:t>
+              <w:t xml:space="preserve">The ViT-B/16 checkpoint (version </w:t>
             </w:r>
             <w:r>
               <w:rPr>
@@ -3918,7 +4234,7 @@
                 <w:sz w:val="15"/>
                 <w:szCs w:val="15"/>
               </w:rPr>
-              <w:t xml:space="preserve">, device mps). GAN, DnCNN and baselines are research-only.</w:t>
+              <w:t xml:space="preserve">, device mps) plus three add-ons: visible-decay probe, pilot U-Net, proxy shelf-life. GAN, DnCNN and baselines are research-only.</w:t>
             </w:r>
           </w:p>
         </w:tc>
@@ -4412,7 +4728,7 @@
                 <w:sz w:val="15"/>
                 <w:szCs w:val="15"/>
               </w:rPr>
-              <w:t xml:space="preserve">It already is an integrated single-model AI application. The originally specified multi-model scope still lacks: reviewed decay masks → U-Net; valid time-to-endpoint labels → shelf-life; bounding boxes → detection; evaluation on real-world (non-lab) photos; calibration; third-party deployment.</w:t>
+              <w:t xml:space="preserve">It is an integrated AI application. Still missing for the full specified scope: human-drawn decay masks → a validated U-Net (current one is a pilot); measured time-to-endpoint labels → true shelf-life (current one is a proxy); bounding boxes → detection; evaluation on real-world (non-lab) photos; calibration; third-party deployment.</w:t>
             </w:r>
           </w:p>
         </w:tc>
@@ -5563,7 +5879,7 @@
                 <w:sz w:val="15"/>
                 <w:szCs w:val="15"/>
               </w:rPr>
-              <w:t xml:space="preserve">pytest: 33 passed in 4.86s; E2E: 11/11</w:t>
+              <w:t xml:space="preserve">pytest: 37 passed in 4.84s; E2E: 11/11</w:t>
             </w:r>
           </w:p>
         </w:tc>
@@ -6467,36 +6783,36 @@
                 <w:sz w:val="15"/>
                 <w:szCs w:val="15"/>
               </w:rPr>
-              <w:t xml:space="preserve">U-Net decay segmentation</w:t>
+              <w:t xml:space="preserve">Validated U-Net decay segmentation</w:t>
             </w:r>
           </w:p>
         </w:tc>
         <w:tc>
           <w:tcPr>
             <w:tcW w:type="dxa" w:w="1445"/>
-            <w:shd w:fill="F6D5CC" w:color="auto" w:val="clear"/>
-            <w:tcMar>
-              <w:top w:type="dxa" w:w="50"/>
-              <w:left w:type="dxa" w:w="80"/>
-              <w:bottom w:type="dxa" w:w="50"/>
-              <w:right w:type="dxa" w:w="80"/>
-            </w:tcMar>
-            <w:vAlign w:val="center"/>
-          </w:tcPr>
-          <w:p>
-            <w:pPr>
-              <w:spacing w:after="0" w:before="0"/>
-            </w:pPr>
-            <w:r>
-              <w:rPr>
-                <w:rFonts w:ascii="Calibri" w:cs="Calibri" w:eastAsia="Calibri" w:hAnsi="Calibri"/>
-                <w:b w:val="false"/>
-                <w:bCs w:val="false"/>
-                <w:color w:val="1E1E1E"/>
-                <w:sz w:val="15"/>
-                <w:szCs w:val="15"/>
-              </w:rPr>
-              <w:t xml:space="preserve">BLOCKED</w:t>
+            <w:shd w:fill="FCEFC7" w:color="auto" w:val="clear"/>
+            <w:tcMar>
+              <w:top w:type="dxa" w:w="50"/>
+              <w:left w:type="dxa" w:w="80"/>
+              <w:bottom w:type="dxa" w:w="50"/>
+              <w:right w:type="dxa" w:w="80"/>
+            </w:tcMar>
+            <w:vAlign w:val="center"/>
+          </w:tcPr>
+          <w:p>
+            <w:pPr>
+              <w:spacing w:after="0" w:before="0"/>
+            </w:pPr>
+            <w:r>
+              <w:rPr>
+                <w:rFonts w:ascii="Calibri" w:cs="Calibri" w:eastAsia="Calibri" w:hAnsi="Calibri"/>
+                <w:b w:val="false"/>
+                <w:bCs w:val="false"/>
+                <w:color w:val="1E1E1E"/>
+                <w:sz w:val="15"/>
+                <w:szCs w:val="15"/>
+              </w:rPr>
+              <w:t xml:space="preserve">IN PROGRESS</w:t>
             </w:r>
           </w:p>
         </w:tc>
@@ -6524,7 +6840,7 @@
                 <w:sz w:val="15"/>
                 <w:szCs w:val="15"/>
               </w:rPr>
-              <w:t xml:space="preserve">Human-reviewed decay masks (≥ a few hundred) with a written rubric; currently 0 reviewed, 12 machine proposals.</w:t>
+              <w:t xml:space="preserve">Human-drawn decay polygons (current pilot is trained on machine-generated masks).</w:t>
             </w:r>
           </w:p>
         </w:tc>
@@ -6558,7 +6874,7 @@
                 <w:sz w:val="15"/>
                 <w:szCs w:val="15"/>
               </w:rPr>
-              <w:t xml:space="preserve">Shelf-life regression</w:t>
+              <w:t xml:space="preserve">True shelf-life prediction</w:t>
             </w:r>
           </w:p>
         </w:tc>
@@ -6616,7 +6932,7 @@
                 <w:sz w:val="15"/>
                 <w:szCs w:val="15"/>
               </w:rPr>
-              <w:t xml:space="preserve">Measured time-to-endpoint labels; TR-6 provides none.</w:t>
+              <w:t xml:space="preserve">Measured time-to-endpoint labels; the served estimate is a proxy from date-based labels.</w:t>
             </w:r>
           </w:p>
         </w:tc>
@@ -7158,7 +7474,7 @@
         <w:rPr>
           <w:rFonts w:ascii="Calibri" w:cs="Calibri" w:eastAsia="Calibri" w:hAnsi="Calibri"/>
         </w:rPr>
-        <w:t xml:space="preserve"> → 33 passed in 4.86s</w:t>
+        <w:t xml:space="preserve"> → 37 passed in 4.84s</w:t>
       </w:r>
     </w:p>
     <w:p>

</xml_diff>